<commit_message>
test(ingest): strengthen anydoc eval corpus
</commit_message>
<xml_diff>
--- a/packages/ingest/evals/anydoc/fixtures/prose.docx
+++ b/packages/ingest/evals/anydoc/fixtures/prose.docx
@@ -149,8 +149,47 @@
       <w:formProt w:val="false"/>
       <w:textDirection w:val="lrTb"/>
     </w:sectPr>
+    <w:p>
+      <w:r>
+        <w:t>Illustrated evidence</w:t>
+      </w:r>
+      <w:r>
+        <w:footnoteReference w:id="1"/>
+      </w:r>
+    </w:p>
+    <w:p>
+      <w:r>
+        <w:drawing>
+          <wp:inline>
+            <wp:extent cx="9525" cy="9525"/>
+            <wp:docPr id="1" name="Crux pixel"/>
+            <a:graphic xmlns:a="http://schemas.openxmlformats.org/drawingml/2006/main">
+              <a:graphicData uri="http://schemas.openxmlformats.org/drawingml/2006/picture">
+                <pic:pic xmlns:pic="http://schemas.openxmlformats.org/drawingml/2006/picture">
+                  <pic:blipFill>
+                    <a:blip r:embed="rIdCruxImage"/>
+                  </pic:blipFill>
+                </pic:pic>
+              </a:graphicData>
+            </a:graphic>
+          </wp:inline>
+        </w:drawing>
+      </w:r>
+    </w:p>
   </w:body>
 </w:document>
+</file>
+
+<file path=word/footnotes.xml><?xml version="1.0" encoding="utf-8"?>
+<w:footnotes xmlns:w="http://schemas.openxmlformats.org/wordprocessingml/2006/main">
+  <w:footnote w:id="1">
+    <w:p>
+      <w:r>
+        <w:t>Crux footnote evidence.</w:t>
+      </w:r>
+    </w:p>
+  </w:footnote>
+</w:footnotes>
 </file>
 
 <file path=word/numbering.xml><?xml version="1.0" encoding="utf-8"?>

</xml_diff>